<commit_message>
Complete final report QA
</commit_message>
<xml_diff>
--- a/docs/final-project-completion-report.docx
+++ b/docs/final-project-completion-report.docx
@@ -2104,6 +2104,59 @@
           </w:p>
         </w:tc>
       </w:tr>
+      <w:tr>
+        <w:tc>
+          <w:tcPr>
+            <w:tcW w:type="dxa" w:w="2664"/>
+            <w:tcMar>
+              <w:top w:w="80" w:type="dxa"/>
+              <w:start w:w="120" w:type="dxa"/>
+              <w:bottom w:w="80" w:type="dxa"/>
+              <w:end w:w="120" w:type="dxa"/>
+            </w:tcMar>
+            <w:vAlign w:val="center"/>
+          </w:tcPr>
+          <w:p>
+            <w:r>
+              <w:t>Word document visual QA</w:t>
+            </w:r>
+          </w:p>
+        </w:tc>
+        <w:tc>
+          <w:tcPr>
+            <w:tcW w:type="dxa" w:w="4248"/>
+            <w:tcMar>
+              <w:top w:w="80" w:type="dxa"/>
+              <w:start w:w="120" w:type="dxa"/>
+              <w:bottom w:w="80" w:type="dxa"/>
+              <w:end w:w="120" w:type="dxa"/>
+            </w:tcMar>
+            <w:vAlign w:val="center"/>
+          </w:tcPr>
+          <w:p>
+            <w:r>
+              <w:t>Microsoft Word PDF export plus PNG page inspection</w:t>
+            </w:r>
+          </w:p>
+        </w:tc>
+        <w:tc>
+          <w:tcPr>
+            <w:tcW w:type="dxa" w:w="2448"/>
+            <w:tcMar>
+              <w:top w:w="80" w:type="dxa"/>
+              <w:start w:w="120" w:type="dxa"/>
+              <w:bottom w:w="80" w:type="dxa"/>
+              <w:end w:w="120" w:type="dxa"/>
+            </w:tcMar>
+            <w:vAlign w:val="center"/>
+          </w:tcPr>
+          <w:p>
+            <w:r>
+              <w:t>Passed, 6 pages inspected</w:t>
+            </w:r>
+          </w:p>
+        </w:tc>
+      </w:tr>
     </w:tbl>
     <w:p>
       <w:r>
@@ -2226,7 +2279,7 @@
     </w:p>
     <w:p>
       <w:pPr>
-        <w:pStyle w:val="ListNumber"/>
+        <w:pStyle w:val="ListBullet"/>
         <w:spacing w:after="80" w:line="280" w:lineRule="auto"/>
       </w:pPr>
       <w:r>
@@ -2235,7 +2288,7 @@
     </w:p>
     <w:p>
       <w:pPr>
-        <w:pStyle w:val="ListNumber"/>
+        <w:pStyle w:val="ListBullet"/>
         <w:spacing w:after="80" w:line="280" w:lineRule="auto"/>
       </w:pPr>
       <w:r>
@@ -2244,7 +2297,7 @@
     </w:p>
     <w:p>
       <w:pPr>
-        <w:pStyle w:val="ListNumber"/>
+        <w:pStyle w:val="ListBullet"/>
         <w:spacing w:after="80" w:line="280" w:lineRule="auto"/>
       </w:pPr>
       <w:r>
@@ -2253,7 +2306,7 @@
     </w:p>
     <w:p>
       <w:pPr>
-        <w:pStyle w:val="ListNumber"/>
+        <w:pStyle w:val="ListBullet"/>
         <w:spacing w:after="80" w:line="280" w:lineRule="auto"/>
       </w:pPr>
       <w:r>
@@ -2262,7 +2315,7 @@
     </w:p>
     <w:p>
       <w:pPr>
-        <w:pStyle w:val="ListNumber"/>
+        <w:pStyle w:val="ListBullet"/>
         <w:spacing w:after="80" w:line="280" w:lineRule="auto"/>
       </w:pPr>
       <w:r>
@@ -2271,7 +2324,7 @@
     </w:p>
     <w:p>
       <w:pPr>
-        <w:pStyle w:val="ListNumber"/>
+        <w:pStyle w:val="ListBullet"/>
         <w:spacing w:after="80" w:line="280" w:lineRule="auto"/>
       </w:pPr>
       <w:r>
@@ -2280,7 +2333,7 @@
     </w:p>
     <w:p>
       <w:pPr>
-        <w:pStyle w:val="ListNumber"/>
+        <w:pStyle w:val="ListBullet"/>
         <w:spacing w:after="80" w:line="280" w:lineRule="auto"/>
       </w:pPr>
       <w:r>
@@ -2289,7 +2342,7 @@
     </w:p>
     <w:p>
       <w:pPr>
-        <w:pStyle w:val="ListNumber"/>
+        <w:pStyle w:val="ListBullet"/>
         <w:spacing w:after="80" w:line="280" w:lineRule="auto"/>
       </w:pPr>
       <w:r>
@@ -2298,7 +2351,7 @@
     </w:p>
     <w:p>
       <w:pPr>
-        <w:pStyle w:val="ListNumber"/>
+        <w:pStyle w:val="ListBullet"/>
         <w:spacing w:after="80" w:line="280" w:lineRule="auto"/>
       </w:pPr>
       <w:r>
@@ -2307,7 +2360,7 @@
     </w:p>
     <w:p>
       <w:pPr>
-        <w:pStyle w:val="ListNumber"/>
+        <w:pStyle w:val="ListBullet"/>
         <w:spacing w:after="80" w:line="280" w:lineRule="auto"/>
       </w:pPr>
       <w:r>
@@ -2316,7 +2369,7 @@
     </w:p>
     <w:p>
       <w:pPr>
-        <w:pStyle w:val="ListNumber"/>
+        <w:pStyle w:val="ListBullet"/>
         <w:spacing w:after="80" w:line="280" w:lineRule="auto"/>
       </w:pPr>
       <w:r>
@@ -2325,7 +2378,7 @@
     </w:p>
     <w:p>
       <w:pPr>
-        <w:pStyle w:val="ListNumber"/>
+        <w:pStyle w:val="ListBullet"/>
         <w:spacing w:after="80" w:line="280" w:lineRule="auto"/>
       </w:pPr>
       <w:r>
@@ -2334,7 +2387,7 @@
     </w:p>
     <w:p>
       <w:pPr>
-        <w:pStyle w:val="ListNumber"/>
+        <w:pStyle w:val="ListBullet"/>
         <w:spacing w:after="80" w:line="280" w:lineRule="auto"/>
       </w:pPr>
       <w:r>

</xml_diff>